<commit_message>
Refactor to 3-page dynamic flow and update design documentation
</commit_message>
<xml_diff>
--- a/DesLab_Hackathon6696_Design_Document.docx
+++ b/DesLab_Hackathon6696_Design_Document.docx
@@ -11,7 +11,9 @@
           <w:b/>
           <w:sz w:val="36"/>
         </w:rPr>
-        <w:t>UniSphere (DesLab Hackathon 6696)\nComprehensive System Design Document</w:t>
+        <w:t>UniSphere Design Document (Updated)</w:t>
+        <w:br/>
+        <w:t>DesLab Hackathon 6696</w:t>
       </w:r>
     </w:p>
     <w:p>
@@ -22,7 +24,7 @@
         <w:rPr>
           <w:i/>
         </w:rPr>
-        <w:t>Version 1.0 | Date: 2026-04-01 16:22</w:t>
+        <w:t>Version 2.0 | 2026-04-01 16:51</w:t>
         <w:br/>
       </w:r>
       <w:r>
@@ -35,17 +37,12 @@
         <w:pStyle w:val="Heading1"/>
       </w:pPr>
       <w:r>
-        <w:t>1. Executive Summary</w:t>
+        <w:t>1. Executive Overview</w:t>
       </w:r>
     </w:p>
     <w:p>
       <w:r>
-        <w:t>UniSphere is a unified recommendation platform that aggregates and personalizes content across videos, music, podcasts, movies, and news within a single interface. The platform is built as a production-oriented web application with a FastAPI backend, SQLite persistence, and a responsive UI. It now implements an agentic recommendation flow using LangChain + LangGraph for planning, live content refresh, and final ranking.</w:t>
-      </w:r>
-    </w:p>
-    <w:p>
-      <w:r>
-        <w:t>The primary design objective is to solve fragmented discovery across disconnected platforms while preserving usability, relevance, explainability, and extensibility.</w:t>
+        <w:t>UniSphere is an agentic, cross-domain recommendation platform delivering unified discovery across videos, music, podcasts, movies, and news. The current version is redesigned as a three-page guided workflow with dynamic live-source retrieval and no dependency on static seed catalogs.</w:t>
       </w:r>
     </w:p>
     <w:p>
@@ -53,17 +50,12 @@
         <w:pStyle w:val="Heading1"/>
       </w:pPr>
       <w:r>
-        <w:t>2. Problem Statement</w:t>
+        <w:t>2. Problem and Requirements Alignment</w:t>
       </w:r>
     </w:p>
     <w:p>
       <w:r>
-        <w:t>Users consume content across multiple vertical platforms. Traditional recommendation systems are siloed by domain and fail to transfer user intent between formats. This creates discovery friction and weak personalization continuity.</w:t>
-      </w:r>
-    </w:p>
-    <w:p>
-      <w:r>
-        <w:t>UniSphere addresses this by:</w:t>
+        <w:t>The platform addresses fragmented content ecosystems by learning user intent once and applying it across multiple formats. The updated architecture prioritizes relevance, usability, and real-world operability over prototype-only behavior.</w:t>
       </w:r>
     </w:p>
     <w:p>
@@ -71,7 +63,7 @@
         <w:pStyle w:val="ListBullet"/>
       </w:pPr>
       <w:r>
-        <w:t>Normalizing heterogeneous content into a shared schema.</w:t>
+        <w:t>Single journey from intent capture to personalized feed.</w:t>
       </w:r>
     </w:p>
     <w:p>
@@ -79,7 +71,7 @@
         <w:pStyle w:val="ListBullet"/>
       </w:pPr>
       <w:r>
-        <w:t>Modeling user preference as a cross-domain profile (interests, mood, languages, domain weights).</w:t>
+        <w:t>Dynamic source retrieval instead of static hardcoded catalog dependency.</w:t>
       </w:r>
     </w:p>
     <w:p>
@@ -87,7 +79,7 @@
         <w:pStyle w:val="ListBullet"/>
       </w:pPr>
       <w:r>
-        <w:t>Applying hybrid ranking that combines interest relevance, behavioral affinity, freshness, and popularity.</w:t>
+        <w:t>Explainable recommendations with actionable feedback loop.</w:t>
       </w:r>
     </w:p>
     <w:p>
@@ -95,7 +87,7 @@
         <w:pStyle w:val="ListBullet"/>
       </w:pPr>
       <w:r>
-        <w:t>Using an agent workflow to detect low catalog coverage and trigger live ingestion automatically.</w:t>
+        <w:t>Scalable agent orchestration using LangChain + LangGraph.</w:t>
       </w:r>
     </w:p>
     <w:p>
@@ -103,7 +95,7 @@
         <w:pStyle w:val="Heading1"/>
       </w:pPr>
       <w:r>
-        <w:t>3. Goals and Non-Goals</w:t>
+        <w:t>3. Product UX Flow (3 Pages)</w:t>
       </w:r>
     </w:p>
     <w:p>
@@ -111,7 +103,7 @@
         <w:pStyle w:val="ListNumber"/>
       </w:pPr>
       <w:r>
-        <w:t>3.1 Goals</w:t>
+        <w:t>Page 1: Interest Capture</w:t>
       </w:r>
     </w:p>
     <w:p>
@@ -119,7 +111,7 @@
         <w:pStyle w:val="ListBullet"/>
       </w:pPr>
       <w:r>
-        <w:t>Deliver a complete end-to-end product, not a model-only prototype.</w:t>
+        <w:t>User enters User ID and name.</w:t>
       </w:r>
     </w:p>
     <w:p>
@@ -127,7 +119,7 @@
         <w:pStyle w:val="ListBullet"/>
       </w:pPr>
       <w:r>
-        <w:t>Provide a single recommendation feed with meaningful cross-domain mixing.</w:t>
+        <w:t>User selects interests from curated relevant options.</w:t>
       </w:r>
     </w:p>
     <w:p>
@@ -135,7 +127,7 @@
         <w:pStyle w:val="ListBullet"/>
       </w:pPr>
       <w:r>
-        <w:t>Ensure user-understandable reasoning for each recommendation.</w:t>
+        <w:t>User provides demand_text: explicit natural-language requirement.</w:t>
       </w:r>
     </w:p>
     <w:p>
@@ -143,7 +135,15 @@
         <w:pStyle w:val="ListBullet"/>
       </w:pPr>
       <w:r>
-        <w:t>Support continuous adaptation through user feedback.</w:t>
+        <w:t>On submit, draft profile is stored client-side and user advances.</w:t>
+      </w:r>
+    </w:p>
+    <w:p>
+      <w:pPr>
+        <w:pStyle w:val="ListNumber"/>
+      </w:pPr>
+      <w:r>
+        <w:t>Page 2: Preference Tuning</w:t>
       </w:r>
     </w:p>
     <w:p>
@@ -151,7 +151,23 @@
         <w:pStyle w:val="ListBullet"/>
       </w:pPr>
       <w:r>
-        <w:t>Make the system easy to run locally and easy to extend with additional sources.</w:t>
+        <w:t>User selects language preferences.</w:t>
+      </w:r>
+    </w:p>
+    <w:p>
+      <w:pPr>
+        <w:pStyle w:val="ListBullet"/>
+      </w:pPr>
+      <w:r>
+        <w:t>User sets domain weights for cross-domain balancing.</w:t>
+      </w:r>
+    </w:p>
+    <w:p>
+      <w:pPr>
+        <w:pStyle w:val="ListBullet"/>
+      </w:pPr>
+      <w:r>
+        <w:t>System persists profile via API and redirects to feed page.</w:t>
       </w:r>
     </w:p>
     <w:p>
@@ -159,7 +175,7 @@
         <w:pStyle w:val="ListNumber"/>
       </w:pPr>
       <w:r>
-        <w:t>3.2 Non-Goals (Current Version)</w:t>
+        <w:t>Page 3: Dynamic Recommendation Feed</w:t>
       </w:r>
     </w:p>
     <w:p>
@@ -167,7 +183,7 @@
         <w:pStyle w:val="ListBullet"/>
       </w:pPr>
       <w:r>
-        <w:t>No mandatory third-party LLM API dependency at runtime.</w:t>
+        <w:t>User sees recommendations generated from live dynamic catalog.</w:t>
       </w:r>
     </w:p>
     <w:p>
@@ -175,7 +191,7 @@
         <w:pStyle w:val="ListBullet"/>
       </w:pPr>
       <w:r>
-        <w:t>No advanced collaborative filtering over large user graph yet.</w:t>
+        <w:t>User can filter domain, max duration, and result limit.</w:t>
       </w:r>
     </w:p>
     <w:p>
@@ -183,7 +199,15 @@
         <w:pStyle w:val="ListBullet"/>
       </w:pPr>
       <w:r>
-        <w:t>No enterprise auth/SSO in this version.</w:t>
+        <w:t>Feedback actions (like/save/dislike/hide) continuously refine results.</w:t>
+      </w:r>
+    </w:p>
+    <w:p>
+      <w:pPr>
+        <w:pStyle w:val="ListBullet"/>
+      </w:pPr>
+      <w:r>
+        <w:t>Open Link points to source provider URLs in new tab.</w:t>
       </w:r>
     </w:p>
     <w:p>
@@ -191,7 +215,7 @@
         <w:pStyle w:val="Heading1"/>
       </w:pPr>
       <w:r>
-        <w:t>4. Product Features</w:t>
+        <w:t>4. Architecture</w:t>
       </w:r>
     </w:p>
     <w:p>
@@ -199,7 +223,7 @@
         <w:pStyle w:val="ListBullet"/>
       </w:pPr>
       <w:r>
-        <w:t>Unified onboarding with user profile and domain-weight preferences.</w:t>
+        <w:t>Frontend: Multi-page Jinja templates + vanilla JS state orchestration.</w:t>
       </w:r>
     </w:p>
     <w:p>
@@ -207,7 +231,7 @@
         <w:pStyle w:val="ListBullet"/>
       </w:pPr>
       <w:r>
-        <w:t>Cross-domain recommendation feed for five domains.</w:t>
+        <w:t>API Layer: FastAPI endpoints for profile, recommendations, feedback, and metadata.</w:t>
       </w:r>
     </w:p>
     <w:p>
@@ -215,7 +239,7 @@
         <w:pStyle w:val="ListBullet"/>
       </w:pPr>
       <w:r>
-        <w:t>Language-aware recommendation and graceful fallback behavior.</w:t>
+        <w:t>Agent Layer: LangGraph state machine with plan -&gt; refresh -&gt; retrieve flow.</w:t>
       </w:r>
     </w:p>
     <w:p>
@@ -223,7 +247,7 @@
         <w:pStyle w:val="ListBullet"/>
       </w:pPr>
       <w:r>
-        <w:t>Real-time feedback actions: like, save, dislike, hide, view.</w:t>
+        <w:t>Relevance Engine: Hybrid scoring with interest-demand matching and behavioral signals.</w:t>
       </w:r>
     </w:p>
     <w:p>
@@ -231,7 +255,7 @@
         <w:pStyle w:val="ListBullet"/>
       </w:pPr>
       <w:r>
-        <w:t>Automatic re-ranking after user actions.</w:t>
+        <w:t>Storage: SQLite for profiles, feedback, and dynamic content records.</w:t>
       </w:r>
     </w:p>
     <w:p>
@@ -239,7 +263,100 @@
         <w:pStyle w:val="ListBullet"/>
       </w:pPr>
       <w:r>
-        <w:t>Agent-driven live source sync when data coverage is low.</w:t>
+        <w:t>Ingestion: Live source adapters (iTunes, TVMaze, Internet Archive, Google News RSS).</w:t>
+      </w:r>
+    </w:p>
+    <w:p>
+      <w:pPr>
+        <w:pStyle w:val="Heading1"/>
+      </w:pPr>
+      <w:r>
+        <w:t>5. Major Design Decisions</w:t>
+      </w:r>
+    </w:p>
+    <w:p>
+      <w:r>
+        <w:rPr>
+          <w:b/>
+        </w:rPr>
+        <w:t xml:space="preserve">Removed mood input: </w:t>
+      </w:r>
+      <w:r>
+        <w:t>Mood was ambiguous and low-signal; replaced with explicit demand_text for stronger intent specificity.</w:t>
+      </w:r>
+    </w:p>
+    <w:p>
+      <w:r>
+        <w:rPr>
+          <w:b/>
+        </w:rPr>
+        <w:t xml:space="preserve">Interest options on page 1: </w:t>
+      </w:r>
+      <w:r>
+        <w:t>Improves onboarding speed and avoids vague free-form cold start.</w:t>
+      </w:r>
+    </w:p>
+    <w:p>
+      <w:r>
+        <w:rPr>
+          <w:b/>
+        </w:rPr>
+        <w:t xml:space="preserve">Dynamic-only data mode: </w:t>
+      </w:r>
+      <w:r>
+        <w:t>Static seed content removed from runtime to ensure recommendations represent live and current sources.</w:t>
+      </w:r>
+    </w:p>
+    <w:p>
+      <w:r>
+        <w:rPr>
+          <w:b/>
+        </w:rPr>
+        <w:t xml:space="preserve">3-page wizard: </w:t>
+      </w:r>
+      <w:r>
+        <w:t>Reduces cognitive load and removes ambiguous button ordering.</w:t>
+      </w:r>
+    </w:p>
+    <w:p>
+      <w:r>
+        <w:rPr>
+          <w:b/>
+        </w:rPr>
+        <w:t xml:space="preserve">Agentic orchestration: </w:t>
+      </w:r>
+      <w:r>
+        <w:t>Enables automatic source refresh when inventory is low for selected preferences.</w:t>
+      </w:r>
+    </w:p>
+    <w:p>
+      <w:r>
+        <w:rPr>
+          <w:b/>
+        </w:rPr>
+        <w:t xml:space="preserve">Strict relevance filtering: </w:t>
+      </w:r>
+      <w:r>
+        <w:t>Penalizes and filters low-overlap candidates to improve topical relevance.</w:t>
+      </w:r>
+    </w:p>
+    <w:p>
+      <w:r>
+        <w:rPr>
+          <w:b/>
+        </w:rPr>
+        <w:t xml:space="preserve">Domain-weight enforcement: </w:t>
+      </w:r>
+      <w:r>
+        <w:t>0% domains are excluded from mixed output to honor explicit user intent.</w:t>
+      </w:r>
+    </w:p>
+    <w:p>
+      <w:pPr>
+        <w:pStyle w:val="Heading1"/>
+      </w:pPr>
+      <w:r>
+        <w:t>6. Agent Workflow Design</w:t>
       </w:r>
     </w:p>
     <w:p>
@@ -247,7 +364,7 @@
         <w:pStyle w:val="ListBullet"/>
       </w:pPr>
       <w:r>
-        <w:t>Manual API endpoint for live catalog refresh.</w:t>
+        <w:t>Plan Node: Inspect inventory coverage for selected languages/domain.</w:t>
       </w:r>
     </w:p>
     <w:p>
@@ -255,20 +372,7 @@
         <w:pStyle w:val="ListBullet"/>
       </w:pPr>
       <w:r>
-        <w:t>Responsive and themed UI suitable for demo and real usage.</w:t>
-      </w:r>
-    </w:p>
-    <w:p>
-      <w:pPr>
-        <w:pStyle w:val="Heading1"/>
-      </w:pPr>
-      <w:r>
-        <w:t>5. High-Level Architecture</w:t>
-      </w:r>
-    </w:p>
-    <w:p>
-      <w:r>
-        <w:t>Core architectural layers:</w:t>
+        <w:t>Refresh Node: Fetch live content if coverage is below threshold.</w:t>
       </w:r>
     </w:p>
     <w:p>
@@ -276,252 +380,12 @@
         <w:pStyle w:val="ListBullet"/>
       </w:pPr>
       <w:r>
-        <w:t>Presentation Layer: Server-rendered HTML + Vanilla JS/CSS frontend.</w:t>
-      </w:r>
-    </w:p>
-    <w:p>
-      <w:pPr>
-        <w:pStyle w:val="ListBullet"/>
-      </w:pPr>
-      <w:r>
-        <w:t>API Layer: FastAPI endpoints for profile, recommendations, feedback, and live sync.</w:t>
-      </w:r>
-    </w:p>
-    <w:p>
-      <w:pPr>
-        <w:pStyle w:val="ListBullet"/>
-      </w:pPr>
-      <w:r>
-        <w:t>Agent Orchestration Layer: LangGraph state graph and LangChain tools.</w:t>
-      </w:r>
-    </w:p>
-    <w:p>
-      <w:pPr>
-        <w:pStyle w:val="ListBullet"/>
-      </w:pPr>
-      <w:r>
-        <w:t>Recommendation Engine Layer: Hybrid scoring and diversified reranking.</w:t>
-      </w:r>
-    </w:p>
-    <w:p>
-      <w:pPr>
-        <w:pStyle w:val="ListBullet"/>
-      </w:pPr>
-      <w:r>
-        <w:t>Data Layer: SQLite for content, user profiles, and feedback.</w:t>
-      </w:r>
-    </w:p>
-    <w:p>
-      <w:pPr>
-        <w:pStyle w:val="ListBullet"/>
-      </w:pPr>
-      <w:r>
-        <w:t>Ingestion Layer: Static seed datasets plus live provider connectors.</w:t>
-      </w:r>
-    </w:p>
-    <w:p>
-      <w:pPr>
-        <w:pStyle w:val="ListNumber"/>
-      </w:pPr>
-      <w:r>
-        <w:t>5.1 Request Flow (Recommendation)</w:t>
-      </w:r>
-    </w:p>
-    <w:p>
-      <w:pPr>
-        <w:pStyle w:val="ListBullet"/>
-      </w:pPr>
-      <w:r>
-        <w:t>Client submits user context and filters.</w:t>
-      </w:r>
-    </w:p>
-    <w:p>
-      <w:pPr>
-        <w:pStyle w:val="ListBullet"/>
-      </w:pPr>
-      <w:r>
-        <w:t>API validates profile and delegates to agent workflow.</w:t>
-      </w:r>
-    </w:p>
-    <w:p>
-      <w:pPr>
-        <w:pStyle w:val="ListBullet"/>
-      </w:pPr>
-      <w:r>
-        <w:t>Plan node inspects catalog coverage for selected filters.</w:t>
-      </w:r>
-    </w:p>
-    <w:p>
-      <w:pPr>
-        <w:pStyle w:val="ListBullet"/>
-      </w:pPr>
-      <w:r>
-        <w:t>If coverage is insufficient, refresh node fetches live content and upserts into DB.</w:t>
-      </w:r>
-    </w:p>
-    <w:p>
-      <w:pPr>
-        <w:pStyle w:val="ListBullet"/>
-      </w:pPr>
-      <w:r>
-        <w:t>Retrieve node runs recommender scoring and returns ranked items with diagnostics.</w:t>
-      </w:r>
-    </w:p>
-    <w:p>
-      <w:pPr>
-        <w:pStyle w:val="ListBullet"/>
-      </w:pPr>
-      <w:r>
-        <w:t>UI renders cards and explanations; feedback updates preference signal.</w:t>
-      </w:r>
-    </w:p>
-    <w:p>
-      <w:pPr>
-        <w:pStyle w:val="Heading1"/>
-      </w:pPr>
-      <w:r>
-        <w:t>6. Key Design Decisions and Rationale</w:t>
+        <w:t>Retrieve Node: Rank items, apply fallback policy, return diagnostics.</w:t>
       </w:r>
     </w:p>
     <w:p>
       <w:r>
-        <w:rPr>
-          <w:b/>
-        </w:rPr>
-        <w:t xml:space="preserve">FastAPI over heavier frameworks: </w:t>
-      </w:r>
-      <w:r>
-        <w:t>High productivity, explicit typing, simple deployment, strong API ergonomics.</w:t>
-      </w:r>
-    </w:p>
-    <w:p>
-      <w:r>
-        <w:rPr>
-          <w:b/>
-        </w:rPr>
-        <w:t xml:space="preserve">SQLite for persistence: </w:t>
-      </w:r>
-      <w:r>
-        <w:t>Reliable local demo and hackathon delivery with zero infrastructure overhead.</w:t>
-      </w:r>
-    </w:p>
-    <w:p>
-      <w:r>
-        <w:rPr>
-          <w:b/>
-        </w:rPr>
-        <w:t xml:space="preserve">Hybrid ranking over pure CF: </w:t>
-      </w:r>
-      <w:r>
-        <w:t>Works immediately with small data and explicit profile signal; avoids cold-start collapse.</w:t>
-      </w:r>
-    </w:p>
-    <w:p>
-      <w:r>
-        <w:rPr>
-          <w:b/>
-        </w:rPr>
-        <w:t xml:space="preserve">LangGraph state workflow: </w:t>
-      </w:r>
-      <w:r>
-        <w:t>Provides deterministic, inspectable agent behavior for plan-refresh-retrieve orchestration.</w:t>
-      </w:r>
-    </w:p>
-    <w:p>
-      <w:r>
-        <w:rPr>
-          <w:b/>
-        </w:rPr>
-        <w:t xml:space="preserve">Tool-based live ingestion: </w:t>
-      </w:r>
-      <w:r>
-        <w:t>Keeps external source integrations modular and replaceable.</w:t>
-      </w:r>
-    </w:p>
-    <w:p>
-      <w:r>
-        <w:rPr>
-          <w:b/>
-        </w:rPr>
-        <w:t xml:space="preserve">Explainable recommendations: </w:t>
-      </w:r>
-      <w:r>
-        <w:t>Improves trust and user understanding during evaluation.</w:t>
-      </w:r>
-    </w:p>
-    <w:p>
-      <w:r>
-        <w:rPr>
-          <w:b/>
-        </w:rPr>
-        <w:t xml:space="preserve">Strict domain-weight semantics: </w:t>
-      </w:r>
-      <w:r>
-        <w:t>Ensures user intent is respected (e.g., 100% movies returns movies-only feed).</w:t>
-      </w:r>
-    </w:p>
-    <w:p>
-      <w:r>
-        <w:rPr>
-          <w:b/>
-        </w:rPr>
-        <w:t xml:space="preserve">Sanitization of live text: </w:t>
-      </w:r>
-      <w:r>
-        <w:t>Prevents HTML/url noise from degrading UI quality.</w:t>
-      </w:r>
-    </w:p>
-    <w:p>
-      <w:r>
-        <w:rPr>
-          <w:b/>
-        </w:rPr>
-        <w:t xml:space="preserve">Single-action UX flow: </w:t>
-      </w:r>
-      <w:r>
-        <w:t>Removes confusion between overlapping actions; profile submit now directly fetches recommendations.</w:t>
-      </w:r>
-    </w:p>
-    <w:p>
-      <w:pPr>
-        <w:pStyle w:val="Heading1"/>
-      </w:pPr>
-      <w:r>
-        <w:t>7. Agentic Workflow (LangChain + LangGraph)</w:t>
-      </w:r>
-    </w:p>
-    <w:p>
-      <w:r>
-        <w:t>Workflow graph:</w:t>
-      </w:r>
-    </w:p>
-    <w:p>
-      <w:pPr>
-        <w:pStyle w:val="ListBullet"/>
-      </w:pPr>
-      <w:r>
-        <w:t>Plan Node: Inspects inventory for selected domain/language and estimates coverage adequacy.</w:t>
-      </w:r>
-    </w:p>
-    <w:p>
-      <w:pPr>
-        <w:pStyle w:val="ListBullet"/>
-      </w:pPr>
-      <w:r>
-        <w:t>Refresh Node: Fetches live records if coverage threshold is not met.</w:t>
-      </w:r>
-    </w:p>
-    <w:p>
-      <w:pPr>
-        <w:pStyle w:val="ListBullet"/>
-      </w:pPr>
-      <w:r>
-        <w:t>Retrieve Node: Scores, reranks, applies fallback policies, returns explanations and diagnostics.</w:t>
-      </w:r>
-    </w:p>
-    <w:p>
-      <w:r>
-        <w:t>LangChain tools used in workflow:</w:t>
+        <w:t>Agent tools:</w:t>
       </w:r>
     </w:p>
     <w:p>
@@ -545,7 +409,7 @@
         <w:pStyle w:val="Heading1"/>
       </w:pPr>
       <w:r>
-        <w:t>8. Live Data Connector Design</w:t>
+        <w:t>7. Live Connectors and Content Quality</w:t>
       </w:r>
     </w:p>
     <w:tbl>
@@ -587,7 +451,7 @@
           </w:tcPr>
           <w:p>
             <w:r>
-              <w:t>Strategy</w:t>
+              <w:t>Retrieval Strategy</w:t>
             </w:r>
           </w:p>
         </w:tc>
@@ -597,7 +461,7 @@
           </w:tcPr>
           <w:p>
             <w:r>
-              <w:t>Notes</w:t>
+              <w:t>Quality Controls</w:t>
             </w:r>
           </w:p>
         </w:tc>
@@ -619,7 +483,7 @@
           </w:tcPr>
           <w:p>
             <w:r>
-              <w:t>iTunes Search API</w:t>
+              <w:t>iTunes</w:t>
             </w:r>
           </w:p>
         </w:tc>
@@ -629,7 +493,7 @@
           </w:tcPr>
           <w:p>
             <w:r>
-              <w:t>Query by intent + language hint</w:t>
+              <w:t>Intent + language search</w:t>
             </w:r>
           </w:p>
         </w:tc>
@@ -639,7 +503,7 @@
           </w:tcPr>
           <w:p>
             <w:r>
-              <w:t>Normalizes artist/title/genre.</w:t>
+              <w:t>URL/title normalization; dedupe by stable hashed ID</w:t>
             </w:r>
           </w:p>
         </w:tc>
@@ -661,7 +525,7 @@
           </w:tcPr>
           <w:p>
             <w:r>
-              <w:t>iTunes Search API</w:t>
+              <w:t>iTunes</w:t>
             </w:r>
           </w:p>
         </w:tc>
@@ -671,7 +535,7 @@
           </w:tcPr>
           <w:p>
             <w:r>
-              <w:t>Query shows by intent</w:t>
+              <w:t>Intent search</w:t>
             </w:r>
           </w:p>
         </w:tc>
@@ -681,7 +545,7 @@
           </w:tcPr>
           <w:p>
             <w:r>
-              <w:t>Maps to podcast schema with stable IDs.</w:t>
+              <w:t>Normalized feed metadata; stable IDs</w:t>
             </w:r>
           </w:p>
         </w:tc>
@@ -713,7 +577,7 @@
           </w:tcPr>
           <w:p>
             <w:r>
-              <w:t>Search shows by query</w:t>
+              <w:t>Show search by demand terms</w:t>
             </w:r>
           </w:p>
         </w:tc>
@@ -723,7 +587,7 @@
           </w:tcPr>
           <w:p>
             <w:r>
-              <w:t>Uses summary/genres/runtime as movie-like metadata.</w:t>
+              <w:t>Summary cleanup; runtime normalization</w:t>
             </w:r>
           </w:p>
         </w:tc>
@@ -755,7 +619,7 @@
           </w:tcPr>
           <w:p>
             <w:r>
-              <w:t>Advanced search on title/media</w:t>
+              <w:t>Advanced search API</w:t>
             </w:r>
           </w:p>
         </w:tc>
@@ -765,7 +629,7 @@
           </w:tcPr>
           <w:p>
             <w:r>
-              <w:t>Useful open metadata and links.</w:t>
+              <w:t>Source URL verification; metadata cleanup</w:t>
             </w:r>
           </w:p>
         </w:tc>
@@ -797,7 +661,7 @@
           </w:tcPr>
           <w:p>
             <w:r>
-              <w:t>RSS search feed parsing</w:t>
+              <w:t>RSS query by demand</w:t>
             </w:r>
           </w:p>
         </w:tc>
@@ -807,15 +671,97 @@
           </w:tcPr>
           <w:p>
             <w:r>
-              <w:t>Sanitized text to remove HTML noise.</w:t>
+              <w:t>HTML/URL stripping and safe text sanitization</w:t>
             </w:r>
           </w:p>
         </w:tc>
       </w:tr>
     </w:tbl>
     <w:p>
+      <w:pPr>
+        <w:pStyle w:val="Heading1"/>
+      </w:pPr>
       <w:r>
-        <w:t>Connector outputs are normalized to the internal schema and upserted. A deterministic ID strategy (domain + URL hash) prevents duplicate explosions across sync runs.</w:t>
+        <w:t>8. Data Model</w:t>
+      </w:r>
+    </w:p>
+    <w:p>
+      <w:r>
+        <w:t>content_items</w:t>
+      </w:r>
+    </w:p>
+    <w:p>
+      <w:pPr>
+        <w:pStyle w:val="ListBullet"/>
+      </w:pPr>
+      <w:r>
+        <w:t>id, domain, title, description, tags, language</w:t>
+      </w:r>
+    </w:p>
+    <w:p>
+      <w:pPr>
+        <w:pStyle w:val="ListBullet"/>
+      </w:pPr>
+      <w:r>
+        <w:t>duration_minutes, source, url, creator, published_at, popularity</w:t>
+      </w:r>
+    </w:p>
+    <w:p>
+      <w:pPr>
+        <w:pStyle w:val="ListBullet"/>
+      </w:pPr>
+      <w:r>
+        <w:t>live records use ID prefix live_ and are upserted idempotently</w:t>
+      </w:r>
+    </w:p>
+    <w:p>
+      <w:r>
+        <w:t>user_profiles</w:t>
+      </w:r>
+    </w:p>
+    <w:p>
+      <w:pPr>
+        <w:pStyle w:val="ListBullet"/>
+      </w:pPr>
+      <w:r>
+        <w:t>user_id, name, interests, demand_text, languages</w:t>
+      </w:r>
+    </w:p>
+    <w:p>
+      <w:pPr>
+        <w:pStyle w:val="ListBullet"/>
+      </w:pPr>
+      <w:r>
+        <w:t>moods retained as internal backward-compatible field (empty in new UX)</w:t>
+      </w:r>
+    </w:p>
+    <w:p>
+      <w:pPr>
+        <w:pStyle w:val="ListBullet"/>
+      </w:pPr>
+      <w:r>
+        <w:t>domain_weights normalized to sum ~100</w:t>
+      </w:r>
+    </w:p>
+    <w:p>
+      <w:r>
+        <w:t>user_feedback</w:t>
+      </w:r>
+    </w:p>
+    <w:p>
+      <w:pPr>
+        <w:pStyle w:val="ListBullet"/>
+      </w:pPr>
+      <w:r>
+        <w:t>actions: like, save, dislike, hide, view</w:t>
+      </w:r>
+    </w:p>
+    <w:p>
+      <w:pPr>
+        <w:pStyle w:val="ListBullet"/>
+      </w:pPr>
+      <w:r>
+        <w:t>used to build affinity and suppression signals</w:t>
       </w:r>
     </w:p>
     <w:p>
@@ -823,12 +769,7 @@
         <w:pStyle w:val="Heading1"/>
       </w:pPr>
       <w:r>
-        <w:t>9. Data Model</w:t>
-      </w:r>
-    </w:p>
-    <w:p>
-      <w:r>
-        <w:t>9.1 content_items</w:t>
+        <w:t>9. Relevance Methodology</w:t>
       </w:r>
     </w:p>
     <w:p>
@@ -836,7 +777,7 @@
         <w:pStyle w:val="ListBullet"/>
       </w:pPr>
       <w:r>
-        <w:t>id (TEXT, PK)</w:t>
+        <w:t>Intent expansion with alias maps (e.g., tech -&gt; technology/ai/engineering/startup).</w:t>
       </w:r>
     </w:p>
     <w:p>
@@ -844,7 +785,7 @@
         <w:pStyle w:val="ListBullet"/>
       </w:pPr>
       <w:r>
-        <w:t>domain (videos/music/podcasts/movies/news)</w:t>
+        <w:t>Matching against title + description + tags, not tags only.</w:t>
       </w:r>
     </w:p>
     <w:p>
@@ -852,7 +793,7 @@
         <w:pStyle w:val="ListBullet"/>
       </w:pPr>
       <w:r>
-        <w:t>title, description, tags (JSON), language</w:t>
+        <w:t>Weighted score components: relevance, domain preference, freshness, popularity, affinity.</w:t>
       </w:r>
     </w:p>
     <w:p>
@@ -860,7 +801,7 @@
         <w:pStyle w:val="ListBullet"/>
       </w:pPr>
       <w:r>
-        <w:t>duration_minutes, source, url, creator</w:t>
+        <w:t>Low-relevance penalties and threshold filtering reduce noisy recommendations.</w:t>
       </w:r>
     </w:p>
     <w:p>
@@ -868,65 +809,7 @@
         <w:pStyle w:val="ListBullet"/>
       </w:pPr>
       <w:r>
-        <w:t>published_at, popularity</w:t>
-      </w:r>
-    </w:p>
-    <w:p>
-      <w:r>
-        <w:t>9.2 user_profiles</w:t>
-      </w:r>
-    </w:p>
-    <w:p>
-      <w:pPr>
-        <w:pStyle w:val="ListBullet"/>
-      </w:pPr>
-      <w:r>
-        <w:t>user_id (TEXT, PK), name</w:t>
-      </w:r>
-    </w:p>
-    <w:p>
-      <w:pPr>
-        <w:pStyle w:val="ListBullet"/>
-      </w:pPr>
-      <w:r>
-        <w:t>interests (JSON), moods (JSON), languages (JSON)</w:t>
-      </w:r>
-    </w:p>
-    <w:p>
-      <w:pPr>
-        <w:pStyle w:val="ListBullet"/>
-      </w:pPr>
-      <w:r>
-        <w:t>domain_weights (JSON normalized to sum ~100)</w:t>
-      </w:r>
-    </w:p>
-    <w:p>
-      <w:pPr>
-        <w:pStyle w:val="ListBullet"/>
-      </w:pPr>
-      <w:r>
-        <w:t>updated_at</w:t>
-      </w:r>
-    </w:p>
-    <w:p>
-      <w:r>
-        <w:t>9.3 user_feedback</w:t>
-      </w:r>
-    </w:p>
-    <w:p>
-      <w:pPr>
-        <w:pStyle w:val="ListBullet"/>
-      </w:pPr>
-      <w:r>
-        <w:t>id (INTEGER PK), user_id, content_id, action, ts</w:t>
-      </w:r>
-    </w:p>
-    <w:p>
-      <w:pPr>
-        <w:pStyle w:val="ListBullet"/>
-      </w:pPr>
-      <w:r>
-        <w:t>action in {like, dislike, save, hide, view}</w:t>
+        <w:t>Behavioral feedback updates future ranking instantly.</w:t>
       </w:r>
     </w:p>
     <w:p>
@@ -934,102 +817,7 @@
         <w:pStyle w:val="Heading1"/>
       </w:pPr>
       <w:r>
-        <w:t>10. Recommendation Methodology</w:t>
-      </w:r>
-    </w:p>
-    <w:p>
-      <w:r>
-        <w:t>Current hybrid score includes:</w:t>
-      </w:r>
-    </w:p>
-    <w:p>
-      <w:pPr>
-        <w:pStyle w:val="ListBullet"/>
-      </w:pPr>
-      <w:r>
-        <w:t>Intent relevance from profile interests and mood against title/description/tags.</w:t>
-      </w:r>
-    </w:p>
-    <w:p>
-      <w:pPr>
-        <w:pStyle w:val="ListBullet"/>
-      </w:pPr>
-      <w:r>
-        <w:t>Domain preference weighting from user domain_weights.</w:t>
-      </w:r>
-    </w:p>
-    <w:p>
-      <w:pPr>
-        <w:pStyle w:val="ListBullet"/>
-      </w:pPr>
-      <w:r>
-        <w:t>Freshness decay based on publication age.</w:t>
-      </w:r>
-    </w:p>
-    <w:p>
-      <w:pPr>
-        <w:pStyle w:val="ListBullet"/>
-      </w:pPr>
-      <w:r>
-        <w:t>Popularity normalization.</w:t>
-      </w:r>
-    </w:p>
-    <w:p>
-      <w:pPr>
-        <w:pStyle w:val="ListBullet"/>
-      </w:pPr>
-      <w:r>
-        <w:t>Behavioral affinity from feedback history.</w:t>
-      </w:r>
-    </w:p>
-    <w:p>
-      <w:pPr>
-        <w:pStyle w:val="ListBullet"/>
-      </w:pPr>
-      <w:r>
-        <w:t>Cross-domain transfer effect from tags liked in other domains.</w:t>
-      </w:r>
-    </w:p>
-    <w:p>
-      <w:r>
-        <w:t>Strong relevance controls were added to reduce irrelevant recommendations: alias expansion for key intents (e.g., tech -&gt; technology, ai, engineering), low-relevance penalties, and filtering thresholds when user intent is explicit.</w:t>
-      </w:r>
-    </w:p>
-    <w:p>
-      <w:r>
-        <w:t>Diversification strategy:</w:t>
-      </w:r>
-    </w:p>
-    <w:p>
-      <w:pPr>
-        <w:pStyle w:val="ListBullet"/>
-      </w:pPr>
-      <w:r>
-        <w:t>Weighted round-robin by domain_weights.</w:t>
-      </w:r>
-    </w:p>
-    <w:p>
-      <w:pPr>
-        <w:pStyle w:val="ListBullet"/>
-      </w:pPr>
-      <w:r>
-        <w:t>Domains with 0% weight are excluded from mixed feeds.</w:t>
-      </w:r>
-    </w:p>
-    <w:p>
-      <w:pPr>
-        <w:pStyle w:val="ListBullet"/>
-      </w:pPr>
-      <w:r>
-        <w:t>If a specific domain filter is selected, only that domain is returned.</w:t>
-      </w:r>
-    </w:p>
-    <w:p>
-      <w:pPr>
-        <w:pStyle w:val="Heading1"/>
-      </w:pPr>
-      <w:r>
-        <w:t>11. API Contract</w:t>
+        <w:t>10. API Design</w:t>
       </w:r>
     </w:p>
     <w:tbl>
@@ -1050,7 +838,7 @@
           </w:tcPr>
           <w:p>
             <w:r>
-              <w:t>Method + Path</w:t>
+              <w:t>Endpoint</w:t>
             </w:r>
           </w:p>
         </w:tc>
@@ -1070,7 +858,7 @@
           </w:tcPr>
           <w:p>
             <w:r>
-              <w:t>Key Notes</w:t>
+              <w:t>Notes</w:t>
             </w:r>
           </w:p>
         </w:tc>
@@ -1082,7 +870,7 @@
           </w:tcPr>
           <w:p>
             <w:r>
-              <w:t>GET /api/health</w:t>
+              <w:t>GET /</w:t>
             </w:r>
           </w:p>
         </w:tc>
@@ -1092,7 +880,7 @@
           </w:tcPr>
           <w:p>
             <w:r>
-              <w:t>Health check</w:t>
+              <w:t>Page 1 onboarding</w:t>
             </w:r>
           </w:p>
         </w:tc>
@@ -1102,7 +890,167 @@
           </w:tcPr>
           <w:p>
             <w:r>
-              <w:t>Returns status + timestamp.</w:t>
+              <w:t>Interest options + demand text form</w:t>
+            </w:r>
+          </w:p>
+        </w:tc>
+      </w:tr>
+      <w:tr>
+        <w:tc>
+          <w:tcPr>
+            <w:tcW w:type="dxa" w:w="2880"/>
+          </w:tcPr>
+          <w:p>
+            <w:r>
+              <w:t>GET /preferences</w:t>
+            </w:r>
+          </w:p>
+        </w:tc>
+        <w:tc>
+          <w:tcPr>
+            <w:tcW w:type="dxa" w:w="2880"/>
+          </w:tcPr>
+          <w:p>
+            <w:r>
+              <w:t>Page 2 preferences</w:t>
+            </w:r>
+          </w:p>
+        </w:tc>
+        <w:tc>
+          <w:tcPr>
+            <w:tcW w:type="dxa" w:w="2880"/>
+          </w:tcPr>
+          <w:p>
+            <w:r>
+              <w:t>Language + domain weighting</w:t>
+            </w:r>
+          </w:p>
+        </w:tc>
+      </w:tr>
+      <w:tr>
+        <w:tc>
+          <w:tcPr>
+            <w:tcW w:type="dxa" w:w="2880"/>
+          </w:tcPr>
+          <w:p>
+            <w:r>
+              <w:t>GET /feed</w:t>
+            </w:r>
+          </w:p>
+        </w:tc>
+        <w:tc>
+          <w:tcPr>
+            <w:tcW w:type="dxa" w:w="2880"/>
+          </w:tcPr>
+          <w:p>
+            <w:r>
+              <w:t>Page 3 results</w:t>
+            </w:r>
+          </w:p>
+        </w:tc>
+        <w:tc>
+          <w:tcPr>
+            <w:tcW w:type="dxa" w:w="2880"/>
+          </w:tcPr>
+          <w:p>
+            <w:r>
+              <w:t>Dynamic recommendation feed</w:t>
+            </w:r>
+          </w:p>
+        </w:tc>
+      </w:tr>
+      <w:tr>
+        <w:tc>
+          <w:tcPr>
+            <w:tcW w:type="dxa" w:w="2880"/>
+          </w:tcPr>
+          <w:p>
+            <w:r>
+              <w:t>PUT /api/users/{user_id}/profile</w:t>
+            </w:r>
+          </w:p>
+        </w:tc>
+        <w:tc>
+          <w:tcPr>
+            <w:tcW w:type="dxa" w:w="2880"/>
+          </w:tcPr>
+          <w:p>
+            <w:r>
+              <w:t>Persist profile</w:t>
+            </w:r>
+          </w:p>
+        </w:tc>
+        <w:tc>
+          <w:tcPr>
+            <w:tcW w:type="dxa" w:w="2880"/>
+          </w:tcPr>
+          <w:p>
+            <w:r>
+              <w:t>Includes demand_text</w:t>
+            </w:r>
+          </w:p>
+        </w:tc>
+      </w:tr>
+      <w:tr>
+        <w:tc>
+          <w:tcPr>
+            <w:tcW w:type="dxa" w:w="2880"/>
+          </w:tcPr>
+          <w:p>
+            <w:r>
+              <w:t>GET /api/users/{user_id}/recommendations</w:t>
+            </w:r>
+          </w:p>
+        </w:tc>
+        <w:tc>
+          <w:tcPr>
+            <w:tcW w:type="dxa" w:w="2880"/>
+          </w:tcPr>
+          <w:p>
+            <w:r>
+              <w:t>Get ranked results</w:t>
+            </w:r>
+          </w:p>
+        </w:tc>
+        <w:tc>
+          <w:tcPr>
+            <w:tcW w:type="dxa" w:w="2880"/>
+          </w:tcPr>
+          <w:p>
+            <w:r>
+              <w:t>Agentic plan-refresh-retrieve flow</w:t>
+            </w:r>
+          </w:p>
+        </w:tc>
+      </w:tr>
+      <w:tr>
+        <w:tc>
+          <w:tcPr>
+            <w:tcW w:type="dxa" w:w="2880"/>
+          </w:tcPr>
+          <w:p>
+            <w:r>
+              <w:t>POST /api/users/{user_id}/feedback</w:t>
+            </w:r>
+          </w:p>
+        </w:tc>
+        <w:tc>
+          <w:tcPr>
+            <w:tcW w:type="dxa" w:w="2880"/>
+          </w:tcPr>
+          <w:p>
+            <w:r>
+              <w:t>Record feedback</w:t>
+            </w:r>
+          </w:p>
+        </w:tc>
+        <w:tc>
+          <w:tcPr>
+            <w:tcW w:type="dxa" w:w="2880"/>
+          </w:tcPr>
+          <w:p>
+            <w:r>
+              <w:t>Relevance adaptation</w:t>
             </w:r>
           </w:p>
         </w:tc>
@@ -1134,135 +1082,7 @@
           </w:tcPr>
           <w:p>
             <w:r>
-              <w:t>Domains, actions, content count, agent framework.</w:t>
-            </w:r>
-          </w:p>
-        </w:tc>
-      </w:tr>
-      <w:tr>
-        <w:tc>
-          <w:tcPr>
-            <w:tcW w:type="dxa" w:w="2880"/>
-          </w:tcPr>
-          <w:p>
-            <w:r>
-              <w:t>PUT /api/users/{user_id}/profile</w:t>
-            </w:r>
-          </w:p>
-        </w:tc>
-        <w:tc>
-          <w:tcPr>
-            <w:tcW w:type="dxa" w:w="2880"/>
-          </w:tcPr>
-          <w:p>
-            <w:r>
-              <w:t>Create/update user profile</w:t>
-            </w:r>
-          </w:p>
-        </w:tc>
-        <w:tc>
-          <w:tcPr>
-            <w:tcW w:type="dxa" w:w="2880"/>
-          </w:tcPr>
-          <w:p>
-            <w:r>
-              <w:t>Normalizes domain weights and persists profile.</w:t>
-            </w:r>
-          </w:p>
-        </w:tc>
-      </w:tr>
-      <w:tr>
-        <w:tc>
-          <w:tcPr>
-            <w:tcW w:type="dxa" w:w="2880"/>
-          </w:tcPr>
-          <w:p>
-            <w:r>
-              <w:t>GET /api/users/{user_id}/recommendations</w:t>
-            </w:r>
-          </w:p>
-        </w:tc>
-        <w:tc>
-          <w:tcPr>
-            <w:tcW w:type="dxa" w:w="2880"/>
-          </w:tcPr>
-          <w:p>
-            <w:r>
-              <w:t>Get ranked recommendations</w:t>
-            </w:r>
-          </w:p>
-        </w:tc>
-        <w:tc>
-          <w:tcPr>
-            <w:tcW w:type="dxa" w:w="2880"/>
-          </w:tcPr>
-          <w:p>
-            <w:r>
-              <w:t>Runs LangGraph agent and returns diagnostics.</w:t>
-            </w:r>
-          </w:p>
-        </w:tc>
-      </w:tr>
-      <w:tr>
-        <w:tc>
-          <w:tcPr>
-            <w:tcW w:type="dxa" w:w="2880"/>
-          </w:tcPr>
-          <w:p>
-            <w:r>
-              <w:t>POST /api/users/{user_id}/feedback</w:t>
-            </w:r>
-          </w:p>
-        </w:tc>
-        <w:tc>
-          <w:tcPr>
-            <w:tcW w:type="dxa" w:w="2880"/>
-          </w:tcPr>
-          <w:p>
-            <w:r>
-              <w:t>Record user feedback</w:t>
-            </w:r>
-          </w:p>
-        </w:tc>
-        <w:tc>
-          <w:tcPr>
-            <w:tcW w:type="dxa" w:w="2880"/>
-          </w:tcPr>
-          <w:p>
-            <w:r>
-              <w:t>Updates future ranking behavior.</w:t>
-            </w:r>
-          </w:p>
-        </w:tc>
-      </w:tr>
-      <w:tr>
-        <w:tc>
-          <w:tcPr>
-            <w:tcW w:type="dxa" w:w="2880"/>
-          </w:tcPr>
-          <w:p>
-            <w:r>
-              <w:t>GET /api/users/{user_id}/feedback</w:t>
-            </w:r>
-          </w:p>
-        </w:tc>
-        <w:tc>
-          <w:tcPr>
-            <w:tcW w:type="dxa" w:w="2880"/>
-          </w:tcPr>
-          <w:p>
-            <w:r>
-              <w:t>View feedback summary</w:t>
-            </w:r>
-          </w:p>
-        </w:tc>
-        <w:tc>
-          <w:tcPr>
-            <w:tcW w:type="dxa" w:w="2880"/>
-          </w:tcPr>
-          <w:p>
-            <w:r>
-              <w:t>Returns action counts and entries.</w:t>
+              <w:t>Shows agent framework and content count</w:t>
             </w:r>
           </w:p>
         </w:tc>
@@ -1284,7 +1104,7 @@
           </w:tcPr>
           <w:p>
             <w:r>
-              <w:t>Manual live sync</w:t>
+              <w:t>Manual refresh (optional)</w:t>
             </w:r>
           </w:p>
         </w:tc>
@@ -1294,7 +1114,7 @@
           </w:tcPr>
           <w:p>
             <w:r>
-              <w:t>Optional direct refresh by user/domain.</w:t>
+              <w:t>Dynamic source ingest trigger</w:t>
             </w:r>
           </w:p>
         </w:tc>
@@ -1305,12 +1125,7 @@
         <w:pStyle w:val="Heading1"/>
       </w:pPr>
       <w:r>
-        <w:t>12. UX and Interaction Design</w:t>
-      </w:r>
-    </w:p>
-    <w:p>
-      <w:r>
-        <w:t>Core UX decisions:</w:t>
+        <w:t>11. Robustness Actions Implemented</w:t>
       </w:r>
     </w:p>
     <w:p>
@@ -1318,7 +1133,7 @@
         <w:pStyle w:val="ListBullet"/>
       </w:pPr>
       <w:r>
-        <w:t>Single primary action for onboarding: Save Profile and Get Recommendations.</w:t>
+        <w:t>Database schema migration path for demand_text.</w:t>
       </w:r>
     </w:p>
     <w:p>
@@ -1326,7 +1141,7 @@
         <w:pStyle w:val="ListBullet"/>
       </w:pPr>
       <w:r>
-        <w:t>Single feed-control action: Apply Filters and Refresh Feed.</w:t>
+        <w:t>Static-seed purge at startup (dynamic mode enforcement).</w:t>
       </w:r>
     </w:p>
     <w:p>
@@ -1334,7 +1149,7 @@
         <w:pStyle w:val="ListBullet"/>
       </w:pPr>
       <w:r>
-        <w:t>Avoid dual-action confusion by auto-handling live sync via agent planning.</w:t>
+        <w:t>URL and HTML sanitization for live provider descriptions.</w:t>
       </w:r>
     </w:p>
     <w:p>
@@ -1342,7 +1157,7 @@
         <w:pStyle w:val="ListBullet"/>
       </w:pPr>
       <w:r>
-        <w:t>Recommendation cards expose reason text and quick feedback controls.</w:t>
+        <w:t>Strict domain-weight enforcement in reranking.</w:t>
       </w:r>
     </w:p>
     <w:p>
@@ -1350,7 +1165,15 @@
         <w:pStyle w:val="ListBullet"/>
       </w:pPr>
       <w:r>
-        <w:t>Dark themed visual system with responsive card layout and overflow controls.</w:t>
+        <w:t>Card overflow and text-clamp controls in UI.</w:t>
+      </w:r>
+    </w:p>
+    <w:p>
+      <w:pPr>
+        <w:pStyle w:val="ListBullet"/>
+      </w:pPr>
+      <w:r>
+        <w:t>Wizard flow eliminates action-order confusion.</w:t>
       </w:r>
     </w:p>
     <w:p>
@@ -1358,7 +1181,7 @@
         <w:pStyle w:val="Heading1"/>
       </w:pPr>
       <w:r>
-        <w:t>13. Error Handling and Resilience</w:t>
+        <w:t>12. Security and Trust</w:t>
       </w:r>
     </w:p>
     <w:p>
@@ -1366,7 +1189,7 @@
         <w:pStyle w:val="ListBullet"/>
       </w:pPr>
       <w:r>
-        <w:t>Input validation on profile schema and domain constraints.</w:t>
+        <w:t>Input sanitization for user_id and external metadata.</w:t>
       </w:r>
     </w:p>
     <w:p>
@@ -1374,7 +1197,7 @@
         <w:pStyle w:val="ListBullet"/>
       </w:pPr>
       <w:r>
-        <w:t>Graceful fallback if live providers fail or timeout.</w:t>
+        <w:t>No client-side secret required for baseline operation.</w:t>
       </w:r>
     </w:p>
     <w:p>
@@ -1382,7 +1205,7 @@
         <w:pStyle w:val="ListBullet"/>
       </w:pPr>
       <w:r>
-        <w:t>Language fallback to English when exact language inventory is empty (configurable).</w:t>
+        <w:t>Links open in new tab with rel=noopener for safety.</w:t>
       </w:r>
     </w:p>
     <w:p>
@@ -1390,7 +1213,15 @@
         <w:pStyle w:val="ListBullet"/>
       </w:pPr>
       <w:r>
-        <w:t>Sanitization of external text to avoid malformed UI output.</w:t>
+        <w:t>Provider URLs are surfaced transparently for user trust.</w:t>
+      </w:r>
+    </w:p>
+    <w:p>
+      <w:pPr>
+        <w:pStyle w:val="Heading1"/>
+      </w:pPr>
+      <w:r>
+        <w:t>13. Scalability Roadmap</w:t>
       </w:r>
     </w:p>
     <w:p>
@@ -1398,7 +1229,39 @@
         <w:pStyle w:val="ListBullet"/>
       </w:pPr>
       <w:r>
-        <w:t>Idempotent upsert for both seed and live records.</w:t>
+        <w:t>Replace SQLite with PostgreSQL for multi-user concurrency.</w:t>
+      </w:r>
+    </w:p>
+    <w:p>
+      <w:pPr>
+        <w:pStyle w:val="ListBullet"/>
+      </w:pPr>
+      <w:r>
+        <w:t>Introduce async jobs for connector refresh.</w:t>
+      </w:r>
+    </w:p>
+    <w:p>
+      <w:pPr>
+        <w:pStyle w:val="ListBullet"/>
+      </w:pPr>
+      <w:r>
+        <w:t>Add vector search and embedding-based retrieval.</w:t>
+      </w:r>
+    </w:p>
+    <w:p>
+      <w:pPr>
+        <w:pStyle w:val="ListBullet"/>
+      </w:pPr>
+      <w:r>
+        <w:t>Add user auth and saved-list syncing across sessions.</w:t>
+      </w:r>
+    </w:p>
+    <w:p>
+      <w:pPr>
+        <w:pStyle w:val="ListBullet"/>
+      </w:pPr>
+      <w:r>
+        <w:t>Add offline evaluation metrics (NDCG, precision@k, diversity@k).</w:t>
       </w:r>
     </w:p>
     <w:p>
@@ -1406,7 +1269,7 @@
         <w:pStyle w:val="Heading1"/>
       </w:pPr>
       <w:r>
-        <w:t>14. Security and Privacy Considerations</w:t>
+        <w:t>14. Verification Summary</w:t>
       </w:r>
     </w:p>
     <w:p>
@@ -1414,7 +1277,7 @@
         <w:pStyle w:val="ListBullet"/>
       </w:pPr>
       <w:r>
-        <w:t>No hardcoded secrets required for core functionality.</w:t>
+        <w:t>All three page routes render successfully.</w:t>
       </w:r>
     </w:p>
     <w:p>
@@ -1422,7 +1285,7 @@
         <w:pStyle w:val="ListBullet"/>
       </w:pPr>
       <w:r>
-        <w:t>External fetches are read-only metadata pulls from public endpoints.</w:t>
+        <w:t>Profile with interests + demand_text saves successfully.</w:t>
       </w:r>
     </w:p>
     <w:p>
@@ -1430,7 +1293,7 @@
         <w:pStyle w:val="ListBullet"/>
       </w:pPr>
       <w:r>
-        <w:t>Input normalization and ID sanitization reduce injection risk in profile paths.</w:t>
+        <w:t>Recommendations return live_* items with valid HTTP links.</w:t>
       </w:r>
     </w:p>
     <w:p>
@@ -1438,7 +1301,15 @@
         <w:pStyle w:val="ListBullet"/>
       </w:pPr>
       <w:r>
-        <w:t>No sensitive personal identity fields are required in the current model.</w:t>
+        <w:t>No static seed records remain after startup purge.</w:t>
+      </w:r>
+    </w:p>
+    <w:p>
+      <w:pPr>
+        <w:pStyle w:val="ListBullet"/>
+      </w:pPr>
+      <w:r>
+        <w:t>No active diagnostics errors in workspace after refactor.</w:t>
       </w:r>
     </w:p>
     <w:p>
@@ -1446,271 +1317,7 @@
         <w:pStyle w:val="Heading1"/>
       </w:pPr>
       <w:r>
-        <w:t>15. Performance and Scalability</w:t>
-      </w:r>
-    </w:p>
-    <w:p>
-      <w:pPr>
-        <w:pStyle w:val="ListBullet"/>
-      </w:pPr>
-      <w:r>
-        <w:t>SQLite is suitable for hackathon and small-team deployments.</w:t>
-      </w:r>
-    </w:p>
-    <w:p>
-      <w:pPr>
-        <w:pStyle w:val="ListBullet"/>
-      </w:pPr>
-      <w:r>
-        <w:t>Recommendation runtime remains low due to constrained in-memory scoring set.</w:t>
-      </w:r>
-    </w:p>
-    <w:p>
-      <w:pPr>
-        <w:pStyle w:val="ListBullet"/>
-      </w:pPr>
-      <w:r>
-        <w:t>Live sync is bounded by per-domain limits to control latency.</w:t>
-      </w:r>
-    </w:p>
-    <w:p>
-      <w:pPr>
-        <w:pStyle w:val="ListBullet"/>
-      </w:pPr>
-      <w:r>
-        <w:t>Scale-up path: PostgreSQL + Redis + async task queue + vector retrieval.</w:t>
-      </w:r>
-    </w:p>
-    <w:p>
-      <w:pPr>
-        <w:pStyle w:val="ListBullet"/>
-      </w:pPr>
-      <w:r>
-        <w:t>Future path: profile embeddings and ANN for high-volume personalization.</w:t>
-      </w:r>
-    </w:p>
-    <w:p>
-      <w:pPr>
-        <w:pStyle w:val="Heading1"/>
-      </w:pPr>
-      <w:r>
-        <w:t>16. Testing and Verification Summary</w:t>
-      </w:r>
-    </w:p>
-    <w:p>
-      <w:pPr>
-        <w:pStyle w:val="ListBullet"/>
-      </w:pPr>
-      <w:r>
-        <w:t>API smoke tests for profile, recommendations, feedback, and live refresh.</w:t>
-      </w:r>
-    </w:p>
-    <w:p>
-      <w:pPr>
-        <w:pStyle w:val="ListBullet"/>
-      </w:pPr>
-      <w:r>
-        <w:t>Validation that domain-weight constraints are enforced (100% single domain behavior).</w:t>
-      </w:r>
-    </w:p>
-    <w:p>
-      <w:pPr>
-        <w:pStyle w:val="ListBullet"/>
-      </w:pPr>
-      <w:r>
-        <w:t>Validation that Hindi-only profiles return Hindi content where available.</w:t>
-      </w:r>
-    </w:p>
-    <w:p>
-      <w:pPr>
-        <w:pStyle w:val="ListBullet"/>
-      </w:pPr>
-      <w:r>
-        <w:t>Validation that formatting sanitization prevents HTML/url overflow in cards.</w:t>
-      </w:r>
-    </w:p>
-    <w:p>
-      <w:pPr>
-        <w:pStyle w:val="ListBullet"/>
-      </w:pPr>
-      <w:r>
-        <w:t>Static diagnostics + syntax compilation checks before publish.</w:t>
-      </w:r>
-    </w:p>
-    <w:p>
-      <w:pPr>
-        <w:pStyle w:val="Heading1"/>
-      </w:pPr>
-      <w:r>
-        <w:t>17. Deployment and Operations</w:t>
-      </w:r>
-    </w:p>
-    <w:p>
-      <w:r>
-        <w:t>Local run steps:</w:t>
-      </w:r>
-    </w:p>
-    <w:p>
-      <w:pPr>
-        <w:pStyle w:val="ListNumber"/>
-      </w:pPr>
-      <w:r>
-        <w:t>Clone repository.</w:t>
-      </w:r>
-    </w:p>
-    <w:p>
-      <w:pPr>
-        <w:pStyle w:val="ListNumber"/>
-      </w:pPr>
-      <w:r>
-        <w:t>Run ./run.sh (creates/uses .venv, installs requirements, starts server).</w:t>
-      </w:r>
-    </w:p>
-    <w:p>
-      <w:pPr>
-        <w:pStyle w:val="ListNumber"/>
-      </w:pPr>
-      <w:r>
-        <w:t>Open http://localhost:8000.</w:t>
-      </w:r>
-    </w:p>
-    <w:p>
-      <w:r>
-        <w:t>Operational tips:</w:t>
-      </w:r>
-    </w:p>
-    <w:p>
-      <w:pPr>
-        <w:pStyle w:val="ListBullet"/>
-      </w:pPr>
-      <w:r>
-        <w:t>Use /api/health for monitoring.</w:t>
-      </w:r>
-    </w:p>
-    <w:p>
-      <w:pPr>
-        <w:pStyle w:val="ListBullet"/>
-      </w:pPr>
-      <w:r>
-        <w:t>Use /api/meta to verify catalog size and agent status.</w:t>
-      </w:r>
-    </w:p>
-    <w:p>
-      <w:pPr>
-        <w:pStyle w:val="ListBullet"/>
-      </w:pPr>
-      <w:r>
-        <w:t>Use POST /api/live/refresh for explicit content refresh operations.</w:t>
-      </w:r>
-    </w:p>
-    <w:p>
-      <w:pPr>
-        <w:pStyle w:val="Heading1"/>
-      </w:pPr>
-      <w:r>
-        <w:t>18. Trade-offs and Alternatives Considered</w:t>
-      </w:r>
-    </w:p>
-    <w:p>
-      <w:r>
-        <w:rPr>
-          <w:b/>
-        </w:rPr>
-        <w:t xml:space="preserve">Deterministic agentic logic vs fully LLM-driven planning: </w:t>
-      </w:r>
-      <w:r>
-        <w:t>Chosen deterministic flow for reliability, testability, and zero-key operation.</w:t>
-      </w:r>
-    </w:p>
-    <w:p>
-      <w:r>
-        <w:rPr>
-          <w:b/>
-        </w:rPr>
-        <w:t xml:space="preserve">SQLite vs cloud DB: </w:t>
-      </w:r>
-      <w:r>
-        <w:t>SQLite selected for speed of delivery and local reproducibility.</w:t>
-      </w:r>
-    </w:p>
-    <w:p>
-      <w:r>
-        <w:rPr>
-          <w:b/>
-        </w:rPr>
-        <w:t xml:space="preserve">Vanilla JS UI vs heavy SPA framework: </w:t>
-      </w:r>
-      <w:r>
-        <w:t>Vanilla chosen to reduce complexity while maintaining responsiveness.</w:t>
-      </w:r>
-    </w:p>
-    <w:p>
-      <w:pPr>
-        <w:pStyle w:val="Heading1"/>
-      </w:pPr>
-      <w:r>
-        <w:t>19. Future Roadmap</w:t>
-      </w:r>
-    </w:p>
-    <w:p>
-      <w:pPr>
-        <w:pStyle w:val="ListBullet"/>
-      </w:pPr>
-      <w:r>
-        <w:t>Add optional LLM reasoning mode (OpenAI/Ollama) with deterministic fallback.</w:t>
-      </w:r>
-    </w:p>
-    <w:p>
-      <w:pPr>
-        <w:pStyle w:val="ListBullet"/>
-      </w:pPr>
-      <w:r>
-        <w:t>Expand multilingual datasets and locale-aware ranking calibration.</w:t>
-      </w:r>
-    </w:p>
-    <w:p>
-      <w:pPr>
-        <w:pStyle w:val="ListBullet"/>
-      </w:pPr>
-      <w:r>
-        <w:t>Introduce user authentication and personalized session history views.</w:t>
-      </w:r>
-    </w:p>
-    <w:p>
-      <w:pPr>
-        <w:pStyle w:val="ListBullet"/>
-      </w:pPr>
-      <w:r>
-        <w:t>Add observability dashboard for recommendation quality and source health.</w:t>
-      </w:r>
-    </w:p>
-    <w:p>
-      <w:pPr>
-        <w:pStyle w:val="ListBullet"/>
-      </w:pPr>
-      <w:r>
-        <w:t>Add automated tests for ranking regression and UX flow contracts.</w:t>
-      </w:r>
-    </w:p>
-    <w:p>
-      <w:pPr>
-        <w:pStyle w:val="Heading1"/>
-      </w:pPr>
-      <w:r>
-        <w:t>20. Conclusion</w:t>
-      </w:r>
-    </w:p>
-    <w:p>
-      <w:r>
-        <w:t>UniSphere delivers a complete, real-world-oriented recommendation product with a strong agentic architecture, clear design rationale, and practical extensibility. The implemented choices prioritize usability, relevance, and operational simplicity while creating a robust foundation for production-scale evolution.</w:t>
-      </w:r>
-    </w:p>
-    <w:p>
-      <w:pPr>
-        <w:pStyle w:val="Heading1"/>
-      </w:pPr>
-      <w:r>
-        <w:t>Appendix A: Key Repository Files</w:t>
+        <w:t>15. Core File Map (Current)</w:t>
       </w:r>
     </w:p>
     <w:p>
@@ -1758,7 +1365,7 @@
         <w:pStyle w:val="ListBullet"/>
       </w:pPr>
       <w:r>
-        <w:t>app/data_loader.py</w:t>
+        <w:t>app/schemas.py</w:t>
       </w:r>
     </w:p>
     <w:p>
@@ -1766,7 +1373,23 @@
         <w:pStyle w:val="ListBullet"/>
       </w:pPr>
       <w:r>
-        <w:t>app/templates/index.html</w:t>
+        <w:t>app/templates/onboarding.html</w:t>
+      </w:r>
+    </w:p>
+    <w:p>
+      <w:pPr>
+        <w:pStyle w:val="ListBullet"/>
+      </w:pPr>
+      <w:r>
+        <w:t>app/templates/preferences.html</w:t>
+      </w:r>
+    </w:p>
+    <w:p>
+      <w:pPr>
+        <w:pStyle w:val="ListBullet"/>
+      </w:pPr>
+      <w:r>
+        <w:t>app/templates/feed.html</w:t>
       </w:r>
     </w:p>
     <w:p>
@@ -1791,22 +1414,6 @@
       </w:pPr>
       <w:r>
         <w:t>requirements.txt</w:t>
-      </w:r>
-    </w:p>
-    <w:p>
-      <w:pPr>
-        <w:pStyle w:val="ListBullet"/>
-      </w:pPr>
-      <w:r>
-        <w:t>README.md</w:t>
-      </w:r>
-    </w:p>
-    <w:p>
-      <w:pPr>
-        <w:pStyle w:val="ListBullet"/>
-      </w:pPr>
-      <w:r>
-        <w:t>USER_GUIDE.md</w:t>
       </w:r>
     </w:p>
     <w:sectPr>

</xml_diff>